<commit_message>
fix contract fetching data, remove contractsPage
</commit_message>
<xml_diff>
--- a/src/frontend/public/templates/contract/ElectricContract.docx
+++ b/src/frontend/public/templates/contract/ElectricContract.docx
@@ -89,6 +89,14 @@
       <w:r>
         <w:t xml:space="preserve"> system, we, the undersigned, include:</w:t>
       </w:r>
+    </w:p>
+    <w:p>
+      <w:pPr>
+        <w:rPr>
+          <w:b/>
+          <w:bCs/>
+        </w:rPr>
+      </w:pPr>
     </w:p>
     <w:p>
       <w:pPr>
@@ -117,12 +125,6 @@
       </w:r>
     </w:p>
     <w:p>
-      <w:pPr>
-        <w:numPr>
-          <w:ilvl w:val="0"/>
-          <w:numId w:val="1"/>
-        </w:numPr>
-      </w:pPr>
       <w:r>
         <w:t xml:space="preserve">Full name: </w:t>
       </w:r>
@@ -139,12 +141,6 @@
       </w:r>
     </w:p>
     <w:p>
-      <w:pPr>
-        <w:numPr>
-          <w:ilvl w:val="0"/>
-          <w:numId w:val="1"/>
-        </w:numPr>
-      </w:pPr>
       <w:r>
         <w:t xml:space="preserve">Email: </w:t>
       </w:r>
@@ -161,12 +157,6 @@
       </w:r>
     </w:p>
     <w:p>
-      <w:pPr>
-        <w:numPr>
-          <w:ilvl w:val="0"/>
-          <w:numId w:val="1"/>
-        </w:numPr>
-      </w:pPr>
       <w:r>
         <w:t xml:space="preserve">Owner of the </w:t>
       </w:r>
@@ -193,12 +183,6 @@
       </w:r>
     </w:p>
     <w:p>
-      <w:pPr>
-        <w:numPr>
-          <w:ilvl w:val="0"/>
-          <w:numId w:val="2"/>
-        </w:numPr>
-      </w:pPr>
       <w:r>
         <w:t xml:space="preserve">Full name: </w:t>
       </w:r>
@@ -215,12 +199,6 @@
       </w:r>
     </w:p>
     <w:p>
-      <w:pPr>
-        <w:numPr>
-          <w:ilvl w:val="0"/>
-          <w:numId w:val="2"/>
-        </w:numPr>
-      </w:pPr>
       <w:r>
         <w:t xml:space="preserve">Email: </w:t>
       </w:r>

</xml_diff>

<commit_message>
fix contract fetch data
</commit_message>
<xml_diff>
--- a/src/frontend/public/templates/contract/ElectricContract.docx
+++ b/src/frontend/public/templates/contract/ElectricContract.docx
@@ -68,26 +68,10 @@
         <w:t>Today,</w:t>
       </w:r>
       <w:r>
-        <w:t xml:space="preserve"> {</w:t>
-      </w:r>
-      <w:proofErr w:type="spellStart"/>
-      <w:r>
-        <w:t>signedDate</w:t>
-      </w:r>
-      <w:proofErr w:type="spellEnd"/>
-      <w:r>
-        <w:t>}</w:t>
-      </w:r>
-      <w:r>
-        <w:t xml:space="preserve">, at the </w:t>
-      </w:r>
-      <w:proofErr w:type="spellStart"/>
-      <w:r>
-        <w:t>Voltera</w:t>
-      </w:r>
-      <w:proofErr w:type="spellEnd"/>
-      <w:r>
-        <w:t xml:space="preserve"> system, we, the undersigned, include:</w:t>
+        <w:t xml:space="preserve"> {signedDate}</w:t>
+      </w:r>
+      <w:r>
+        <w:t>, at the Voltera system, we, the undersigned, include:</w:t>
       </w:r>
     </w:p>
     <w:p>
@@ -129,15 +113,7 @@
         <w:t xml:space="preserve">Full name: </w:t>
       </w:r>
       <w:r>
-        <w:t>{</w:t>
-      </w:r>
-      <w:proofErr w:type="spellStart"/>
-      <w:r>
-        <w:t>sellerName</w:t>
-      </w:r>
-      <w:proofErr w:type="spellEnd"/>
-      <w:r>
-        <w:t>}</w:t>
+        <w:t>{sellerName}</w:t>
       </w:r>
     </w:p>
     <w:p>
@@ -145,15 +121,7 @@
         <w:t xml:space="preserve">Email: </w:t>
       </w:r>
       <w:r>
-        <w:t>{</w:t>
-      </w:r>
-      <w:proofErr w:type="spellStart"/>
-      <w:r>
-        <w:t>sellerEmail</w:t>
-      </w:r>
-      <w:proofErr w:type="spellEnd"/>
-      <w:r>
-        <w:t>}</w:t>
+        <w:t>{sellerEmail}</w:t>
       </w:r>
     </w:p>
     <w:p>
@@ -187,15 +155,7 @@
         <w:t xml:space="preserve">Full name: </w:t>
       </w:r>
       <w:r>
-        <w:t>{</w:t>
-      </w:r>
-      <w:proofErr w:type="spellStart"/>
-      <w:r>
-        <w:t>buyerName</w:t>
-      </w:r>
-      <w:proofErr w:type="spellEnd"/>
-      <w:r>
-        <w:t>}</w:t>
+        <w:t>{buyerName}</w:t>
       </w:r>
     </w:p>
     <w:p>
@@ -203,15 +163,7 @@
         <w:t xml:space="preserve">Email: </w:t>
       </w:r>
       <w:r>
-        <w:t>{</w:t>
-      </w:r>
-      <w:proofErr w:type="spellStart"/>
-      <w:r>
-        <w:t>buyerEmail</w:t>
-      </w:r>
-      <w:proofErr w:type="spellEnd"/>
-      <w:r>
-        <w:t>}</w:t>
+        <w:t>{buyerEmail}</w:t>
       </w:r>
     </w:p>
     <w:p>
@@ -265,15 +217,7 @@
         <w:t xml:space="preserve">Serial number: </w:t>
       </w:r>
       <w:r>
-        <w:t>{</w:t>
-      </w:r>
-      <w:proofErr w:type="spellStart"/>
-      <w:r>
-        <w:t>serialNumber</w:t>
-      </w:r>
-      <w:proofErr w:type="spellEnd"/>
-      <w:r>
-        <w:t>}</w:t>
+        <w:t>{serialNumber}</w:t>
       </w:r>
     </w:p>
     <w:p>
@@ -287,15 +231,7 @@
         <w:t xml:space="preserve">Original capacity: </w:t>
       </w:r>
       <w:r>
-        <w:t>{</w:t>
-      </w:r>
-      <w:proofErr w:type="spellStart"/>
-      <w:r>
-        <w:t>originalCapacity</w:t>
-      </w:r>
-      <w:proofErr w:type="spellEnd"/>
-      <w:r>
-        <w:t xml:space="preserve">} </w:t>
+        <w:t xml:space="preserve">{originalCapacity} </w:t>
       </w:r>
       <w:r>
         <w:t>kWh</w:t>
@@ -312,15 +248,7 @@
         <w:t xml:space="preserve">Remaining capacity: </w:t>
       </w:r>
       <w:r>
-        <w:t>{</w:t>
-      </w:r>
-      <w:proofErr w:type="spellStart"/>
-      <w:r>
-        <w:t>remainingCapacity</w:t>
-      </w:r>
-      <w:proofErr w:type="spellEnd"/>
-      <w:r>
-        <w:t>}</w:t>
+        <w:t>{remainingCapacity}</w:t>
       </w:r>
       <w:r>
         <w:t xml:space="preserve"> kWh</w:t>
@@ -557,15 +485,7 @@
         </w:numPr>
       </w:pPr>
       <w:r>
-        <w:t xml:space="preserve">This contract takes effect from the date both parties confirm and sign on the </w:t>
-      </w:r>
-      <w:proofErr w:type="spellStart"/>
-      <w:r>
-        <w:t>Voltera</w:t>
-      </w:r>
-      <w:proofErr w:type="spellEnd"/>
-      <w:r>
-        <w:t xml:space="preserve"> system.</w:t>
+        <w:t>This contract takes effect from the date both parties confirm and sign on the Voltera system.</w:t>
       </w:r>
     </w:p>
     <w:p>
@@ -617,7 +537,10 @@
         <w:t>SELLER (Signature)</w:t>
       </w:r>
       <w:r>
-        <w:t xml:space="preserve"> .......................</w:t>
+        <w:t xml:space="preserve"> </w:t>
+      </w:r>
+      <w:r>
+        <w:t>{sellerSigned}</w:t>
       </w:r>
       <w:r>
         <w:br/>
@@ -632,7 +555,10 @@
         <w:t>BUYER (Signature)</w:t>
       </w:r>
       <w:r>
-        <w:t xml:space="preserve"> .......................</w:t>
+        <w:t xml:space="preserve"> </w:t>
+      </w:r>
+      <w:r>
+        <w:t>{buyerSigned}</w:t>
       </w:r>
     </w:p>
     <w:p>

</xml_diff>